<commit_message>
Complete the literature review: ten papers, comparison tables and research gap
- report/literature.py: data and summaries for all ten papers (two read in full,
  eight from abstracts/publisher pages, unconfirmed values marked unverified),
  chronological order, research gap; the team's mm-wave paper is attributed to
  Sehrai et al. (IEEE Access 9, 125348), not Tariq et al.
- report/Literature_Review.docx and LITERATURE.md regenerated
- report/MidSem_Report.docx: literature chapter now filled

Co-Authored-By: Claude Opus 5.5 <noreply@anthropic.com>
Claude-Session: https://claude.ai/code/session_01Ghc2mL7EwcKP3XQsdPmrCw
</commit_message>
<xml_diff>
--- a/report/MidSem_Report.docx
+++ b/report/MidSem_Report.docx
@@ -739,7 +739,7 @@
           <w:szCs w:val="24"/>
         </w:rPr>
         <w:tab/>
-        <w:t>6</w:t>
+        <w:t>7</w:t>
       </w:r>
     </w:p>
     <w:p>
@@ -765,7 +765,7 @@
           <w:szCs w:val="24"/>
         </w:rPr>
         <w:tab/>
-        <w:t>8</w:t>
+        <w:t>9</w:t>
       </w:r>
     </w:p>
     <w:p>
@@ -791,7 +791,7 @@
           <w:szCs w:val="24"/>
         </w:rPr>
         <w:tab/>
-        <w:t>8</w:t>
+        <w:t>9</w:t>
       </w:r>
     </w:p>
     <w:p>
@@ -817,7 +817,7 @@
           <w:szCs w:val="24"/>
         </w:rPr>
         <w:tab/>
-        <w:t>8</w:t>
+        <w:t>9</w:t>
       </w:r>
     </w:p>
     <w:p>
@@ -843,7 +843,7 @@
           <w:szCs w:val="24"/>
         </w:rPr>
         <w:tab/>
-        <w:t>9</w:t>
+        <w:t>10</w:t>
       </w:r>
     </w:p>
     <w:p>
@@ -869,7 +869,7 @@
           <w:szCs w:val="24"/>
         </w:rPr>
         <w:tab/>
-        <w:t>9</w:t>
+        <w:t>10</w:t>
       </w:r>
     </w:p>
     <w:p>
@@ -895,7 +895,7 @@
           <w:szCs w:val="24"/>
         </w:rPr>
         <w:tab/>
-        <w:t>11</w:t>
+        <w:t>12</w:t>
       </w:r>
     </w:p>
     <w:p>
@@ -921,7 +921,7 @@
           <w:szCs w:val="24"/>
         </w:rPr>
         <w:tab/>
-        <w:t>12</w:t>
+        <w:t>13</w:t>
       </w:r>
     </w:p>
     <w:p>
@@ -947,7 +947,7 @@
           <w:szCs w:val="24"/>
         </w:rPr>
         <w:tab/>
-        <w:t>12</w:t>
+        <w:t>13</w:t>
       </w:r>
     </w:p>
     <w:p>
@@ -973,7 +973,7 @@
           <w:szCs w:val="24"/>
         </w:rPr>
         <w:tab/>
-        <w:t>12</w:t>
+        <w:t>13</w:t>
       </w:r>
     </w:p>
     <w:p>
@@ -999,7 +999,7 @@
           <w:szCs w:val="24"/>
         </w:rPr>
         <w:tab/>
-        <w:t>13</w:t>
+        <w:t>14</w:t>
       </w:r>
     </w:p>
     <w:p>
@@ -1025,7 +1025,7 @@
           <w:szCs w:val="24"/>
         </w:rPr>
         <w:tab/>
-        <w:t>15</w:t>
+        <w:t>16</w:t>
       </w:r>
     </w:p>
     <w:p>
@@ -1051,7 +1051,7 @@
           <w:szCs w:val="24"/>
         </w:rPr>
         <w:tab/>
-        <w:t>15</w:t>
+        <w:t>16</w:t>
       </w:r>
     </w:p>
     <w:p>
@@ -1077,7 +1077,7 @@
           <w:szCs w:val="24"/>
         </w:rPr>
         <w:tab/>
-        <w:t>15</w:t>
+        <w:t>16</w:t>
       </w:r>
     </w:p>
     <w:p>
@@ -1103,7 +1103,7 @@
           <w:szCs w:val="24"/>
         </w:rPr>
         <w:tab/>
-        <w:t>17</w:t>
+        <w:t>18</w:t>
       </w:r>
     </w:p>
     <w:p>
@@ -1129,7 +1129,7 @@
           <w:szCs w:val="24"/>
         </w:rPr>
         <w:tab/>
-        <w:t>17</w:t>
+        <w:t>18</w:t>
       </w:r>
     </w:p>
     <w:p>
@@ -1155,7 +1155,7 @@
           <w:szCs w:val="24"/>
         </w:rPr>
         <w:tab/>
-        <w:t>17</w:t>
+        <w:t>18</w:t>
       </w:r>
     </w:p>
     <w:p>
@@ -1181,7 +1181,7 @@
           <w:szCs w:val="24"/>
         </w:rPr>
         <w:tab/>
-        <w:t>17</w:t>
+        <w:t>18</w:t>
       </w:r>
     </w:p>
     <w:p>
@@ -1207,7 +1207,7 @@
           <w:szCs w:val="24"/>
         </w:rPr>
         <w:tab/>
-        <w:t>17</w:t>
+        <w:t>18</w:t>
       </w:r>
     </w:p>
     <w:p>
@@ -1233,7 +1233,7 @@
           <w:szCs w:val="24"/>
         </w:rPr>
         <w:tab/>
-        <w:t>18</w:t>
+        <w:t>19</w:t>
       </w:r>
     </w:p>
     <w:p>
@@ -1259,7 +1259,7 @@
           <w:szCs w:val="24"/>
         </w:rPr>
         <w:tab/>
-        <w:t>18</w:t>
+        <w:t>19</w:t>
       </w:r>
       <w:r>
         <w:fldChar w:fldCharType="end"/>
@@ -1312,7 +1312,7 @@
           <w:szCs w:val="24"/>
         </w:rPr>
         <w:tab/>
-        <w:t>8</w:t>
+        <w:t>9</w:t>
       </w:r>
     </w:p>
     <w:p>
@@ -1338,7 +1338,7 @@
           <w:szCs w:val="24"/>
         </w:rPr>
         <w:tab/>
-        <w:t>10</w:t>
+        <w:t>11</w:t>
       </w:r>
     </w:p>
     <w:p>
@@ -1364,7 +1364,7 @@
           <w:szCs w:val="24"/>
         </w:rPr>
         <w:tab/>
-        <w:t>11</w:t>
+        <w:t>12</w:t>
       </w:r>
     </w:p>
     <w:p>
@@ -1390,7 +1390,7 @@
           <w:szCs w:val="24"/>
         </w:rPr>
         <w:tab/>
-        <w:t>12</w:t>
+        <w:t>13</w:t>
       </w:r>
     </w:p>
     <w:p>
@@ -1467,7 +1467,7 @@
           <w:szCs w:val="24"/>
         </w:rPr>
         <w:tab/>
-        <w:t>12</w:t>
+        <w:t>13</w:t>
       </w:r>
     </w:p>
     <w:p>
@@ -1527,7 +1527,7 @@
           <w:szCs w:val="24"/>
         </w:rPr>
         <w:tab/>
-        <w:t>13</w:t>
+        <w:t>14</w:t>
       </w:r>
     </w:p>
     <w:p>
@@ -1570,7 +1570,7 @@
           <w:szCs w:val="24"/>
         </w:rPr>
         <w:tab/>
-        <w:t>14</w:t>
+        <w:t>15</w:t>
       </w:r>
     </w:p>
     <w:p>
@@ -1596,7 +1596,7 @@
           <w:szCs w:val="24"/>
         </w:rPr>
         <w:tab/>
-        <w:t>14</w:t>
+        <w:t>15</w:t>
       </w:r>
     </w:p>
     <w:p>
@@ -1622,7 +1622,7 @@
           <w:szCs w:val="24"/>
         </w:rPr>
         <w:tab/>
-        <w:t>15</w:t>
+        <w:t>16</w:t>
       </w:r>
     </w:p>
     <w:p>
@@ -1665,7 +1665,7 @@
           <w:szCs w:val="24"/>
         </w:rPr>
         <w:tab/>
-        <w:t>15</w:t>
+        <w:t>16</w:t>
       </w:r>
       <w:r>
         <w:fldChar w:fldCharType="end"/>
@@ -1718,7 +1718,7 @@
           <w:szCs w:val="24"/>
         </w:rPr>
         <w:tab/>
-        <w:t>6</w:t>
+        <w:t>7</w:t>
       </w:r>
     </w:p>
     <w:p>
@@ -1744,7 +1744,7 @@
           <w:szCs w:val="24"/>
         </w:rPr>
         <w:tab/>
-        <w:t>6</w:t>
+        <w:t>7</w:t>
       </w:r>
     </w:p>
     <w:p>
@@ -1770,7 +1770,7 @@
           <w:szCs w:val="24"/>
         </w:rPr>
         <w:tab/>
-        <w:t>9</w:t>
+        <w:t>10</w:t>
       </w:r>
     </w:p>
     <w:p>
@@ -1796,7 +1796,7 @@
           <w:szCs w:val="24"/>
         </w:rPr>
         <w:tab/>
-        <w:t>10</w:t>
+        <w:t>11</w:t>
       </w:r>
     </w:p>
     <w:p>
@@ -1822,7 +1822,7 @@
           <w:szCs w:val="24"/>
         </w:rPr>
         <w:tab/>
-        <w:t>15</w:t>
+        <w:t>16</w:t>
       </w:r>
     </w:p>
     <w:p>
@@ -1848,7 +1848,7 @@
           <w:szCs w:val="24"/>
         </w:rPr>
         <w:tab/>
-        <w:t>17</w:t>
+        <w:t>18</w:t>
       </w:r>
       <w:r>
         <w:fldChar w:fldCharType="end"/>
@@ -2306,7 +2306,7 @@
           <w:sz w:val="24"/>
           <w:szCs w:val="24"/>
         </w:rPr>
-        <w:t>The review covers two groups of papers, selected as described in the separate literature-review document: (i) single wideband antennas whose gain is raised by a metasurface, artificial magnetic conductor (AMC) or frequency selective surface (FSS) reflector, which bear directly on Phase I, and (ii) MIMO antennas that use metasurfaces, which inform Phase II. Every value below was checked against the full text of each paper.</w:t>
+        <w:t>The review covers two groups of papers, selected as described in the separate literature-review document: (i) single wideband antennas whose gain is raised by a metasurface, artificial magnetic conductor (AMC) or frequency selective surface (FSS) reflector, which bear directly on Phase I, and (ii) MIMO antennas that use metasurfaces, which inform Phase II. Two papers were read in full and the rest through their abstracts and publisher pages; values that could not be confirmed are marked “unverified”.</w:t>
       </w:r>
     </w:p>
     <w:p>
@@ -2347,7 +2347,7 @@
           <w:sz w:val="24"/>
           <w:szCs w:val="24"/>
         </w:rPr>
-        <w:t xml:space="preserve"> [13]: [to be completed from the full text]</w:t>
+        <w:t xml:space="preserve"> [13]: A circular-patch UWB monopole backed by double split-ring cells whose split angle varies across the array, so the reflection stays in phase over a broad band; the gain rises by nearly 5.5 dB over UWB, confirmed by measurement.</w:t>
       </w:r>
     </w:p>
     <w:p>
@@ -2361,15 +2361,15 @@
           <w:sz w:val="24"/>
           <w:szCs w:val="24"/>
         </w:rPr>
-        <w:t>AboEl-Hassan et al. (2025)</w:t>
-      </w:r>
-      <w:r>
-        <w:rPr>
-          <w:rFonts w:ascii="Times New Roman" w:hAnsi="Times New Roman" w:cs="Times New Roman"/>
-          <w:sz w:val="24"/>
-          <w:szCs w:val="24"/>
-        </w:rPr>
-        <w:t xml:space="preserve"> [14]: [to be completed from the full text]</w:t>
+        <w:t>Al-Gburi et al. (2022)</w:t>
+      </w:r>
+      <w:r>
+        <w:rPr>
+          <w:rFonts w:ascii="Times New Roman" w:hAnsi="Times New Roman" w:cs="Times New Roman"/>
+          <w:sz w:val="24"/>
+          <w:szCs w:val="24"/>
+        </w:rPr>
+        <w:t xml:space="preserve"> [14]: A CPW-fed ring monopole (15 mm-radius disc origin, FR-4) above a 19 × 19 single-layer FSS with a ground plane; measured gain 8.3–11.5 dB over 2.2–11.9 GHz at a 10 mm profile, with efficiency falling from 97 % to 89 %.</w:t>
       </w:r>
     </w:p>
     <w:p>
@@ -2391,7 +2391,7 @@
           <w:sz w:val="24"/>
           <w:szCs w:val="24"/>
         </w:rPr>
-        <w:t xml:space="preserve"> [15]: [to be completed from the full text]</w:t>
+        <w:t xml:space="preserve"> [15]: A CPW-fed stub-loaded hexagonal patch backed by a single-layer 5 × 5 FSS 9 mm below it; the band grows from 5–17 to 3–18 GHz and the peak gain from 6.5 to 10.5 dBi, confirmed by measurement.</w:t>
       </w:r>
     </w:p>
     <w:p>
@@ -2405,15 +2405,15 @@
           <w:sz w:val="24"/>
           <w:szCs w:val="24"/>
         </w:rPr>
-        <w:t>Al-Gburi et al. (2022)</w:t>
-      </w:r>
-      <w:r>
-        <w:rPr>
-          <w:rFonts w:ascii="Times New Roman" w:hAnsi="Times New Roman" w:cs="Times New Roman"/>
-          <w:sz w:val="24"/>
-          <w:szCs w:val="24"/>
-        </w:rPr>
-        <w:t xml:space="preserve"> [16]: [to be completed from the full text]</w:t>
+        <w:t>Hammache et al. (2024)</w:t>
+      </w:r>
+      <w:r>
+        <w:rPr>
+          <w:rFonts w:ascii="Times New Roman" w:hAnsi="Times New Roman" w:cs="Times New Roman"/>
+          <w:sz w:val="24"/>
+          <w:szCs w:val="24"/>
+        </w:rPr>
+        <w:t xml:space="preserve"> [16]: A compact hexagonal CPW-fed UWB antenna 20 mm above a 7 × 7 single-layer FSS; realized gain rises from 2.2 to 8.4 dBi with a directional pattern, confirmed by measurement.</w:t>
       </w:r>
     </w:p>
     <w:p>
@@ -2427,15 +2427,15 @@
           <w:sz w:val="24"/>
           <w:szCs w:val="24"/>
         </w:rPr>
-        <w:t>Hammache et al. (2024)</w:t>
-      </w:r>
-      <w:r>
-        <w:rPr>
-          <w:rFonts w:ascii="Times New Roman" w:hAnsi="Times New Roman" w:cs="Times New Roman"/>
-          <w:sz w:val="24"/>
-          <w:szCs w:val="24"/>
-        </w:rPr>
-        <w:t xml:space="preserve"> [17]: [to be completed from the full text]</w:t>
+        <w:t>AboEl-Hassan et al. (2025)</w:t>
+      </w:r>
+      <w:r>
+        <w:rPr>
+          <w:rFonts w:ascii="Times New Roman" w:hAnsi="Times New Roman" w:cs="Times New Roman"/>
+          <w:sz w:val="24"/>
+          <w:szCs w:val="24"/>
+        </w:rPr>
+        <w:t xml:space="preserve"> [17]: A CPW-fed octagonal monopole over a ground-backed 5 × 5 AMC with an air gap; over 3.5–6.5 GHz the realized gain reaches up to 11.5 dBi (9.9 dBi is also quoted) with total efficiency above 80 %.</w:t>
       </w:r>
     </w:p>
     <w:p>
@@ -2476,7 +2476,7 @@
           <w:sz w:val="24"/>
           <w:szCs w:val="24"/>
         </w:rPr>
-        <w:t xml:space="preserve"> [18]: [to be completed from the full text]</w:t>
+        <w:t xml:space="preserve"> [18]: Four orthogonal patch elements, each under a 4 × 4 square-patch metasurface, for 3.3–3.87 GHz; ground slots plus pinned metasurface strips give isolation above 32 dB and ECC below 0.001, and the metasurface lifts the element gain from 6.3 to 8.1 dBi.</w:t>
       </w:r>
     </w:p>
     <w:p>
@@ -2490,15 +2490,15 @@
           <w:sz w:val="24"/>
           <w:szCs w:val="24"/>
         </w:rPr>
-        <w:t>Hasan et al. (2022)</w:t>
-      </w:r>
-      <w:r>
-        <w:rPr>
-          <w:rFonts w:ascii="Times New Roman" w:hAnsi="Times New Roman" w:cs="Times New Roman"/>
-          <w:sz w:val="24"/>
-          <w:szCs w:val="24"/>
-        </w:rPr>
-        <w:t xml:space="preserve"> [19]: [to be completed from the full text]</w:t>
+        <w:t>Sehrai et al. (2021)</w:t>
+      </w:r>
+      <w:r>
+        <w:rPr>
+          <w:rFonts w:ascii="Times New Roman" w:hAnsi="Times New Roman" w:cs="Times New Roman"/>
+          <w:sz w:val="24"/>
+          <w:szCs w:val="24"/>
+        </w:rPr>
+        <w:t xml:space="preserve"> [19]: Four elements rotated in 90° steps (24 × 24 mm) with a 2 × 2 non-uniform metasurface behind them for 23.5–29.4 GHz; the peak gain rises from about 7 to 10.44 dB with efficiency above 80 %.</w:t>
       </w:r>
     </w:p>
     <w:p>
@@ -2512,15 +2512,15 @@
           <w:sz w:val="24"/>
           <w:szCs w:val="24"/>
         </w:rPr>
-        <w:t>Althuwayb et al. (2023)</w:t>
-      </w:r>
-      <w:r>
-        <w:rPr>
-          <w:rFonts w:ascii="Times New Roman" w:hAnsi="Times New Roman" w:cs="Times New Roman"/>
-          <w:sz w:val="24"/>
-          <w:szCs w:val="24"/>
-        </w:rPr>
-        <w:t xml:space="preserve"> [20]: [to be completed from the full text]</w:t>
+        <w:t>Hasan et al. (2022)</w:t>
+      </w:r>
+      <w:r>
+        <w:rPr>
+          <w:rFonts w:ascii="Times New Roman" w:hAnsi="Times New Roman" w:cs="Times New Roman"/>
+          <w:sz w:val="24"/>
+          <w:szCs w:val="24"/>
+        </w:rPr>
+        <w:t xml:space="preserve"> [20]: Four orthogonal truncated-corner patches above a copper-backed 10 × 10 array of square-enclosed circular split-ring resonators; about 3.1–7.7 GHz, isolation above 15.5 dB, ECC below 0.004, and realized gain raised from 5.4 to 8.3 dBi.</w:t>
       </w:r>
     </w:p>
     <w:p>
@@ -2534,15 +2534,15 @@
           <w:sz w:val="24"/>
           <w:szCs w:val="24"/>
         </w:rPr>
-        <w:t>Wu et al. (2023)</w:t>
-      </w:r>
-      <w:r>
-        <w:rPr>
-          <w:rFonts w:ascii="Times New Roman" w:hAnsi="Times New Roman" w:cs="Times New Roman"/>
-          <w:sz w:val="24"/>
-          <w:szCs w:val="24"/>
-        </w:rPr>
-        <w:t xml:space="preserve"> [21]: [to be completed from the full text]</w:t>
+        <w:t>Althuwayb et al. (2023)</w:t>
+      </w:r>
+      <w:r>
+        <w:rPr>
+          <w:rFonts w:ascii="Times New Roman" w:hAnsi="Times New Roman" w:cs="Times New Roman"/>
+          <w:sz w:val="24"/>
+          <w:szCs w:val="24"/>
+        </w:rPr>
+        <w:t xml:space="preserve"> [21]: A flexible 2 × 2 array of slotted (metasurface-inspired) triangular radiators with an EBG decoupler for 5.0–6.6 GHz; isolation above 34.8 dB, average gain 10 dBi and efficiency 83 %.</w:t>
       </w:r>
     </w:p>
     <w:p>
@@ -2556,15 +2556,15 @@
           <w:sz w:val="24"/>
           <w:szCs w:val="24"/>
         </w:rPr>
-        <w:t>Metasurface mmWave MIMO (2021)</w:t>
-      </w:r>
-      <w:r>
-        <w:rPr>
-          <w:rFonts w:ascii="Times New Roman" w:hAnsi="Times New Roman" w:cs="Times New Roman"/>
-          <w:sz w:val="24"/>
-          <w:szCs w:val="24"/>
-        </w:rPr>
-        <w:t xml:space="preserve"> [22]: [to be completed from the full text]</w:t>
+        <w:t>Wu et al. (2023)</w:t>
+      </w:r>
+      <w:r>
+        <w:rPr>
+          <w:rFonts w:ascii="Times New Roman" w:hAnsi="Times New Roman" w:cs="Times New Roman"/>
+          <w:sz w:val="24"/>
+          <w:szCs w:val="24"/>
+        </w:rPr>
+        <w:t xml:space="preserve"> [22]: A two-element wearable antenna with a polarization-conversion metasurface for 5 GHz body-area networks: 4.76–6.77 GHz, circular polarization over 4.9–6.17 GHz, isolation above 19.85 dB with an isolation strip, 7.95 dBic.</w:t>
       </w:r>
     </w:p>
     <w:p>
@@ -2877,7 +2877,7 @@
                 <w:sz w:val="17"/>
                 <w:szCs w:val="17"/>
               </w:rPr>
-              <w:t>?</w:t>
+              <w:t>Circular-patch UWB monopole</w:t>
             </w:r>
           </w:p>
         </w:tc>
@@ -2897,7 +2897,7 @@
                 <w:sz w:val="17"/>
                 <w:szCs w:val="17"/>
               </w:rPr>
-              <w:t>?</w:t>
+              <w:t>unverified</w:t>
             </w:r>
           </w:p>
         </w:tc>
@@ -2917,7 +2917,7 @@
                 <w:sz w:val="17"/>
                 <w:szCs w:val="17"/>
               </w:rPr>
-              <w:t>?</w:t>
+              <w:t>Double split rings, split angle varied column by column</w:t>
             </w:r>
           </w:p>
         </w:tc>
@@ -2937,7 +2937,7 @@
                 <w:sz w:val="17"/>
                 <w:szCs w:val="17"/>
               </w:rPr>
-              <w:t>?</w:t>
+              <w:t>Behind, low-profile gap (value unverified)</w:t>
             </w:r>
           </w:p>
         </w:tc>
@@ -2957,7 +2957,7 @@
                 <w:sz w:val="17"/>
                 <w:szCs w:val="17"/>
               </w:rPr>
-              <w:t>?</w:t>
+              <w:t>UWB (limits unverified)</w:t>
             </w:r>
           </w:p>
         </w:tc>
@@ -2977,7 +2977,7 @@
                 <w:sz w:val="17"/>
                 <w:szCs w:val="17"/>
               </w:rPr>
-              <w:t>?</w:t>
+              <w:t>≈ +5.5 dB increase</w:t>
             </w:r>
           </w:p>
         </w:tc>
@@ -3019,7 +3019,7 @@
                 <w:sz w:val="17"/>
                 <w:szCs w:val="17"/>
               </w:rPr>
-              <w:t>?</w:t>
+              <w:t>CPW-fed ring monopole with three legs</w:t>
             </w:r>
           </w:p>
         </w:tc>
@@ -3039,7 +3039,24 @@
                 <w:sz w:val="17"/>
                 <w:szCs w:val="17"/>
               </w:rPr>
-              <w:t>?</w:t>
+              <w:t>FR-4 (ε</w:t>
+            </w:r>
+            <w:r>
+              <w:rPr>
+                <w:rFonts w:ascii="Times New Roman" w:hAnsi="Times New Roman" w:cs="Times New Roman"/>
+                <w:sz w:val="17"/>
+                <w:szCs w:val="17"/>
+                <w:vertAlign w:val="subscript"/>
+              </w:rPr>
+              <w:t>r</w:t>
+            </w:r>
+            <w:r>
+              <w:rPr>
+                <w:rFonts w:ascii="Times New Roman" w:hAnsi="Times New Roman" w:cs="Times New Roman"/>
+                <w:sz w:val="17"/>
+                <w:szCs w:val="17"/>
+              </w:rPr>
+              <w:t xml:space="preserve"> 4.5), 1.6 mm</w:t>
             </w:r>
           </w:p>
         </w:tc>
@@ -3059,7 +3076,7 @@
                 <w:sz w:val="17"/>
                 <w:szCs w:val="17"/>
               </w:rPr>
-              <w:t>?</w:t>
+              <w:t>Two patches + circular loop, 5 × 5 mm cells; 19 × 19 FSS on FR-4, ground plane behind</w:t>
             </w:r>
           </w:p>
         </w:tc>
@@ -3079,7 +3096,7 @@
                 <w:sz w:val="17"/>
                 <w:szCs w:val="17"/>
               </w:rPr>
-              <w:t>?</w:t>
+              <w:t>Behind; total profile 10 mm (≈ λ/4 at 7.1 GHz)</w:t>
             </w:r>
           </w:p>
         </w:tc>
@@ -3099,7 +3116,7 @@
                 <w:sz w:val="17"/>
                 <w:szCs w:val="17"/>
               </w:rPr>
-              <w:t>?</w:t>
+              <w:t>2.1–12.6 → 2.2–11.9 (meas.)</w:t>
             </w:r>
           </w:p>
         </w:tc>
@@ -3119,7 +3136,7 @@
                 <w:sz w:val="17"/>
                 <w:szCs w:val="17"/>
               </w:rPr>
-              <w:t>?</w:t>
+              <w:t>6.7 → 11.5 (11.3 meas.)</w:t>
             </w:r>
           </w:p>
         </w:tc>
@@ -3161,7 +3178,7 @@
                 <w:sz w:val="17"/>
                 <w:szCs w:val="17"/>
               </w:rPr>
-              <w:t>?</w:t>
+              <w:t>CPW-fed hexagonal patch with stubs</w:t>
             </w:r>
           </w:p>
         </w:tc>
@@ -3181,7 +3198,24 @@
                 <w:sz w:val="17"/>
                 <w:szCs w:val="17"/>
               </w:rPr>
-              <w:t>?</w:t>
+              <w:t>Rogers RT/Duroid 6002 (ε</w:t>
+            </w:r>
+            <w:r>
+              <w:rPr>
+                <w:rFonts w:ascii="Times New Roman" w:hAnsi="Times New Roman" w:cs="Times New Roman"/>
+                <w:sz w:val="17"/>
+                <w:szCs w:val="17"/>
+                <w:vertAlign w:val="subscript"/>
+              </w:rPr>
+              <w:t>r</w:t>
+            </w:r>
+            <w:r>
+              <w:rPr>
+                <w:rFonts w:ascii="Times New Roman" w:hAnsi="Times New Roman" w:cs="Times New Roman"/>
+                <w:sz w:val="17"/>
+                <w:szCs w:val="17"/>
+              </w:rPr>
+              <w:t xml:space="preserve"> 2.94), 1.52 mm</w:t>
             </w:r>
           </w:p>
         </w:tc>
@@ -3201,7 +3235,7 @@
                 <w:sz w:val="17"/>
                 <w:szCs w:val="17"/>
               </w:rPr>
-              <w:t>?</w:t>
+              <w:t>Ring joined to a square frame; 5 × 5 FSS</w:t>
             </w:r>
           </w:p>
         </w:tc>
@@ -3221,7 +3255,24 @@
                 <w:sz w:val="17"/>
                 <w:szCs w:val="17"/>
               </w:rPr>
-              <w:t>?</w:t>
+              <w:t>Behind, 9 mm foam spacer (0.09λ</w:t>
+            </w:r>
+            <w:r>
+              <w:rPr>
+                <w:rFonts w:ascii="Times New Roman" w:hAnsi="Times New Roman" w:cs="Times New Roman"/>
+                <w:sz w:val="17"/>
+                <w:szCs w:val="17"/>
+                <w:vertAlign w:val="subscript"/>
+              </w:rPr>
+              <w:t>L</w:t>
+            </w:r>
+            <w:r>
+              <w:rPr>
+                <w:rFonts w:ascii="Times New Roman" w:hAnsi="Times New Roman" w:cs="Times New Roman"/>
+                <w:sz w:val="17"/>
+                <w:szCs w:val="17"/>
+              </w:rPr>
+              <w:t>)</w:t>
             </w:r>
           </w:p>
         </w:tc>
@@ -3241,7 +3292,7 @@
                 <w:sz w:val="17"/>
                 <w:szCs w:val="17"/>
               </w:rPr>
-              <w:t>?</w:t>
+              <w:t>5–17 → 3–18</w:t>
             </w:r>
           </w:p>
         </w:tc>
@@ -3261,7 +3312,7 @@
                 <w:sz w:val="17"/>
                 <w:szCs w:val="17"/>
               </w:rPr>
-              <w:t>?</w:t>
+              <w:t>6.5 → 10.5</w:t>
             </w:r>
           </w:p>
         </w:tc>
@@ -3303,7 +3354,7 @@
                 <w:sz w:val="17"/>
                 <w:szCs w:val="17"/>
               </w:rPr>
-              <w:t>?</w:t>
+              <w:t>CPW-fed hexagonal UWB monopole</w:t>
             </w:r>
           </w:p>
         </w:tc>
@@ -3323,7 +3374,7 @@
                 <w:sz w:val="17"/>
                 <w:szCs w:val="17"/>
               </w:rPr>
-              <w:t>?</w:t>
+              <w:t>unverified</w:t>
             </w:r>
           </w:p>
         </w:tc>
@@ -3343,7 +3394,7 @@
                 <w:sz w:val="17"/>
                 <w:szCs w:val="17"/>
               </w:rPr>
-              <w:t>?</w:t>
+              <w:t>8 × 8 mm cells, 7 × 7 FSS (stopband 3–11.5 GHz)</w:t>
             </w:r>
           </w:p>
         </w:tc>
@@ -3363,7 +3414,7 @@
                 <w:sz w:val="17"/>
                 <w:szCs w:val="17"/>
               </w:rPr>
-              <w:t>?</w:t>
+              <w:t>Behind, 20 mm (0.21λ at 3.1 GHz)</w:t>
             </w:r>
           </w:p>
         </w:tc>
@@ -3383,7 +3434,7 @@
                 <w:sz w:val="17"/>
                 <w:szCs w:val="17"/>
               </w:rPr>
-              <w:t>?</w:t>
+              <w:t>UWB (limits unverified)</w:t>
             </w:r>
           </w:p>
         </w:tc>
@@ -3403,7 +3454,7 @@
                 <w:sz w:val="17"/>
                 <w:szCs w:val="17"/>
               </w:rPr>
-              <w:t>?</w:t>
+              <w:t>2.2 → 8.4 (realized)</w:t>
             </w:r>
           </w:p>
         </w:tc>
@@ -3445,7 +3496,7 @@
                 <w:sz w:val="17"/>
                 <w:szCs w:val="17"/>
               </w:rPr>
-              <w:t>?</w:t>
+              <w:t>CPW-fed octagonal monopole with inverted U-slot</w:t>
             </w:r>
           </w:p>
         </w:tc>
@@ -3465,7 +3516,7 @@
                 <w:sz w:val="17"/>
                 <w:szCs w:val="17"/>
               </w:rPr>
-              <w:t>?</w:t>
+              <w:t>Rogers RT5880, 1.57 mm</w:t>
             </w:r>
           </w:p>
         </w:tc>
@@ -3485,7 +3536,7 @@
                 <w:sz w:val="17"/>
                 <w:szCs w:val="17"/>
               </w:rPr>
-              <w:t>?</w:t>
+              <w:t>5 × 5 AMC, 0° reflection at 7.44 GHz, on RO4003C with full ground</w:t>
             </w:r>
           </w:p>
         </w:tc>
@@ -3505,7 +3556,7 @@
                 <w:sz w:val="17"/>
                 <w:szCs w:val="17"/>
               </w:rPr>
-              <w:t>?</w:t>
+              <w:t>Behind, air gap (5 mm, unconfirmed)</w:t>
             </w:r>
           </w:p>
         </w:tc>
@@ -3525,7 +3576,7 @@
                 <w:sz w:val="17"/>
                 <w:szCs w:val="17"/>
               </w:rPr>
-              <w:t>?</w:t>
+              <w:t>3.5–6.3 → 3.5–6.5</w:t>
             </w:r>
           </w:p>
         </w:tc>
@@ -3545,7 +3596,7 @@
                 <w:sz w:val="17"/>
                 <w:szCs w:val="17"/>
               </w:rPr>
-              <w:t>?</w:t>
+              <w:t>unverified → 9.9–11.5 (sources differ)</w:t>
             </w:r>
           </w:p>
         </w:tc>
@@ -3712,7 +3763,7 @@
                 <w:sz w:val="17"/>
                 <w:szCs w:val="17"/>
               </w:rPr>
-              <w:t>≈ 1.3–5.1 (IEEE gain, no MS) → pending</w:t>
+              <w:t>≈ 2.9–4.9 (IEEE, 3.1–10.6 GHz, no MS) → pending</w:t>
             </w:r>
           </w:p>
         </w:tc>
@@ -3813,9 +3864,9 @@
         <w:gridCol w:w="792"/>
         <w:gridCol w:w="1368"/>
         <w:gridCol w:w="1152"/>
-        <w:gridCol w:w="2232"/>
+        <w:gridCol w:w="2016"/>
         <w:gridCol w:w="1008"/>
-        <w:gridCol w:w="864"/>
+        <w:gridCol w:w="1080"/>
         <w:gridCol w:w="1224"/>
       </w:tblGrid>
       <w:tr>
@@ -3890,7 +3941,7 @@
         </w:tc>
         <w:tc>
           <w:tcPr>
-            <w:tcW w:type="dxa" w:w="2232"/>
+            <w:tcW w:type="dxa" w:w="2016"/>
             <w:vAlign w:val="center"/>
             <w:shd w:val="clear" w:color="auto" w:fill="D9D9D9"/>
           </w:tcPr>
@@ -3934,7 +3985,7 @@
         </w:tc>
         <w:tc>
           <w:tcPr>
-            <w:tcW w:type="dxa" w:w="864"/>
+            <w:tcW w:type="dxa" w:w="1080"/>
             <w:vAlign w:val="center"/>
             <w:shd w:val="clear" w:color="auto" w:fill="D9D9D9"/>
           </w:tcPr>
@@ -4014,7 +4065,24 @@
                 <w:sz w:val="17"/>
                 <w:szCs w:val="17"/>
               </w:rPr>
-              <w:t>?; ?</w:t>
+              <w:t>4 (2 × 2, orthogonal); ≈ 1.75λ</w:t>
+            </w:r>
+            <w:r>
+              <w:rPr>
+                <w:rFonts w:ascii="Times New Roman" w:hAnsi="Times New Roman" w:cs="Times New Roman"/>
+                <w:sz w:val="17"/>
+                <w:szCs w:val="17"/>
+                <w:vertAlign w:val="subscript"/>
+              </w:rPr>
+              <w:t>0</w:t>
+            </w:r>
+            <w:r>
+              <w:rPr>
+                <w:rFonts w:ascii="Times New Roman" w:hAnsi="Times New Roman" w:cs="Times New Roman"/>
+                <w:sz w:val="17"/>
+                <w:szCs w:val="17"/>
+              </w:rPr>
+              <w:t xml:space="preserve"> square</w:t>
             </w:r>
           </w:p>
         </w:tc>
@@ -4034,13 +4102,13 @@
                 <w:sz w:val="17"/>
                 <w:szCs w:val="17"/>
               </w:rPr>
-              <w:t>?</w:t>
+              <w:t>3.3–3.87</w:t>
             </w:r>
           </w:p>
         </w:tc>
         <w:tc>
           <w:tcPr>
-            <w:tcW w:type="dxa" w:w="2232"/>
+            <w:tcW w:type="dxa" w:w="2016"/>
             <w:vAlign w:val="center"/>
           </w:tcPr>
           <w:p>
@@ -4054,7 +4122,7 @@
                 <w:sz w:val="17"/>
                 <w:szCs w:val="17"/>
               </w:rPr>
-              <w:t>?; ?</w:t>
+              <w:t>4 × 4 square-patch metasurface above each patch; gain; strips pinned to ground decouple</w:t>
             </w:r>
           </w:p>
         </w:tc>
@@ -4074,13 +4142,13 @@
                 <w:sz w:val="17"/>
                 <w:szCs w:val="17"/>
               </w:rPr>
-              <w:t>?</w:t>
+              <w:t>&gt; 32</w:t>
             </w:r>
           </w:p>
         </w:tc>
         <w:tc>
           <w:tcPr>
-            <w:tcW w:type="dxa" w:w="864"/>
+            <w:tcW w:type="dxa" w:w="1080"/>
             <w:vAlign w:val="center"/>
           </w:tcPr>
           <w:p>
@@ -4094,7 +4162,7 @@
                 <w:sz w:val="17"/>
                 <w:szCs w:val="17"/>
               </w:rPr>
-              <w:t>?</w:t>
+              <w:t>&lt; 0.001</w:t>
             </w:r>
           </w:p>
         </w:tc>
@@ -4114,7 +4182,7 @@
                 <w:sz w:val="17"/>
                 <w:szCs w:val="17"/>
               </w:rPr>
-              <w:t>?</w:t>
+              <w:t>6.3 → 8.1 (element); 8.72 (array)</w:t>
             </w:r>
           </w:p>
         </w:tc>
@@ -4156,7 +4224,7 @@
                 <w:sz w:val="17"/>
                 <w:szCs w:val="17"/>
               </w:rPr>
-              <w:t>?; ?</w:t>
+              <w:t>4 (rotated 90°); 24 × 24</w:t>
             </w:r>
           </w:p>
         </w:tc>
@@ -4176,13 +4244,13 @@
                 <w:sz w:val="17"/>
                 <w:szCs w:val="17"/>
               </w:rPr>
-              <w:t>?</w:t>
+              <w:t>23.5–29.4</w:t>
             </w:r>
           </w:p>
         </w:tc>
         <w:tc>
           <w:tcPr>
-            <w:tcW w:type="dxa" w:w="2232"/>
+            <w:tcW w:type="dxa" w:w="2016"/>
             <w:vAlign w:val="center"/>
           </w:tcPr>
           <w:p>
@@ -4196,7 +4264,7 @@
                 <w:sz w:val="17"/>
                 <w:szCs w:val="17"/>
               </w:rPr>
-              <w:t>?; ?</w:t>
+              <w:t>2 × 2 non-uniform metasurface; behind the array: gain</w:t>
             </w:r>
           </w:p>
         </w:tc>
@@ -4216,13 +4284,13 @@
                 <w:sz w:val="17"/>
                 <w:szCs w:val="17"/>
               </w:rPr>
-              <w:t>?</w:t>
+              <w:t>unverified</w:t>
             </w:r>
           </w:p>
         </w:tc>
         <w:tc>
           <w:tcPr>
-            <w:tcW w:type="dxa" w:w="864"/>
+            <w:tcW w:type="dxa" w:w="1080"/>
             <w:vAlign w:val="center"/>
           </w:tcPr>
           <w:p>
@@ -4236,7 +4304,7 @@
                 <w:sz w:val="17"/>
                 <w:szCs w:val="17"/>
               </w:rPr>
-              <w:t>?</w:t>
+              <w:t>unverified</w:t>
             </w:r>
           </w:p>
         </w:tc>
@@ -4256,7 +4324,7 @@
                 <w:sz w:val="17"/>
                 <w:szCs w:val="17"/>
               </w:rPr>
-              <w:t>?</w:t>
+              <w:t>≈ 7 → 10.44</w:t>
             </w:r>
           </w:p>
         </w:tc>
@@ -4298,7 +4366,7 @@
                 <w:sz w:val="17"/>
                 <w:szCs w:val="17"/>
               </w:rPr>
-              <w:t>?; ?</w:t>
+              <w:t>4 (orthogonal); 1.05λ × 1.05λ</w:t>
             </w:r>
           </w:p>
         </w:tc>
@@ -4318,13 +4386,13 @@
                 <w:sz w:val="17"/>
                 <w:szCs w:val="17"/>
               </w:rPr>
-              <w:t>?</w:t>
+              <w:t>3.08–7.75 (3.2–7.6 also quoted)</w:t>
             </w:r>
           </w:p>
         </w:tc>
         <w:tc>
           <w:tcPr>
-            <w:tcW w:type="dxa" w:w="2232"/>
+            <w:tcW w:type="dxa" w:w="2016"/>
             <w:vAlign w:val="center"/>
           </w:tcPr>
           <w:p>
@@ -4338,7 +4406,7 @@
                 <w:sz w:val="17"/>
                 <w:szCs w:val="17"/>
               </w:rPr>
-              <w:t>?; ?</w:t>
+              <w:t>10 × 10 square-enclosed circular SRRs, copper-backed, 12 mm air gap below; reflector: gain and isolation</w:t>
             </w:r>
           </w:p>
         </w:tc>
@@ -4358,13 +4426,13 @@
                 <w:sz w:val="17"/>
                 <w:szCs w:val="17"/>
               </w:rPr>
-              <w:t>?</w:t>
+              <w:t>&gt; 15.5</w:t>
             </w:r>
           </w:p>
         </w:tc>
         <w:tc>
           <w:tcPr>
-            <w:tcW w:type="dxa" w:w="864"/>
+            <w:tcW w:type="dxa" w:w="1080"/>
             <w:vAlign w:val="center"/>
           </w:tcPr>
           <w:p>
@@ -4378,7 +4446,7 @@
                 <w:sz w:val="17"/>
                 <w:szCs w:val="17"/>
               </w:rPr>
-              <w:t>?</w:t>
+              <w:t>&lt; 0.004</w:t>
             </w:r>
           </w:p>
         </w:tc>
@@ -4398,7 +4466,7 @@
                 <w:sz w:val="17"/>
                 <w:szCs w:val="17"/>
               </w:rPr>
-              <w:t>?</w:t>
+              <w:t>5.4 → 8.3 (realized)</w:t>
             </w:r>
           </w:p>
         </w:tc>
@@ -4440,7 +4508,7 @@
                 <w:sz w:val="17"/>
                 <w:szCs w:val="17"/>
               </w:rPr>
-              <w:t>?; ?</w:t>
+              <w:t>4 (2 × 2); unverified</w:t>
             </w:r>
           </w:p>
         </w:tc>
@@ -4460,13 +4528,13 @@
                 <w:sz w:val="17"/>
                 <w:szCs w:val="17"/>
               </w:rPr>
-              <w:t>?</w:t>
+              <w:t>5.0–6.6</w:t>
             </w:r>
           </w:p>
         </w:tc>
         <w:tc>
           <w:tcPr>
-            <w:tcW w:type="dxa" w:w="2232"/>
+            <w:tcW w:type="dxa" w:w="2016"/>
             <w:vAlign w:val="center"/>
           </w:tcPr>
           <w:p>
@@ -4480,7 +4548,7 @@
                 <w:sz w:val="17"/>
                 <w:szCs w:val="17"/>
               </w:rPr>
-              <w:t>?; ?</w:t>
+              <w:t>Sub-wavelength slots etched in the radiators; bandwidth and gain; EBG between elements decouples</w:t>
             </w:r>
           </w:p>
         </w:tc>
@@ -4500,13 +4568,13 @@
                 <w:sz w:val="17"/>
                 <w:szCs w:val="17"/>
               </w:rPr>
-              <w:t>?</w:t>
+              <w:t>&gt; 34.8</w:t>
             </w:r>
           </w:p>
         </w:tc>
         <w:tc>
           <w:tcPr>
-            <w:tcW w:type="dxa" w:w="864"/>
+            <w:tcW w:type="dxa" w:w="1080"/>
             <w:vAlign w:val="center"/>
           </w:tcPr>
           <w:p>
@@ -4520,7 +4588,7 @@
                 <w:sz w:val="17"/>
                 <w:szCs w:val="17"/>
               </w:rPr>
-              <w:t>?</w:t>
+              <w:t>unverified</w:t>
             </w:r>
           </w:p>
         </w:tc>
@@ -4540,7 +4608,7 @@
                 <w:sz w:val="17"/>
                 <w:szCs w:val="17"/>
               </w:rPr>
-              <w:t>?</w:t>
+              <w:t>10 (avg.); 8.65–10.5 when bent</w:t>
             </w:r>
           </w:p>
         </w:tc>
@@ -4582,7 +4650,41 @@
                 <w:sz w:val="17"/>
                 <w:szCs w:val="17"/>
               </w:rPr>
-              <w:t>?; ?</w:t>
+              <w:t>2; 1.67λ</w:t>
+            </w:r>
+            <w:r>
+              <w:rPr>
+                <w:rFonts w:ascii="Times New Roman" w:hAnsi="Times New Roman" w:cs="Times New Roman"/>
+                <w:sz w:val="17"/>
+                <w:szCs w:val="17"/>
+                <w:vertAlign w:val="subscript"/>
+              </w:rPr>
+              <w:t>0</w:t>
+            </w:r>
+            <w:r>
+              <w:rPr>
+                <w:rFonts w:ascii="Times New Roman" w:hAnsi="Times New Roman" w:cs="Times New Roman"/>
+                <w:sz w:val="17"/>
+                <w:szCs w:val="17"/>
+              </w:rPr>
+              <w:t xml:space="preserve"> × 0.81λ</w:t>
+            </w:r>
+            <w:r>
+              <w:rPr>
+                <w:rFonts w:ascii="Times New Roman" w:hAnsi="Times New Roman" w:cs="Times New Roman"/>
+                <w:sz w:val="17"/>
+                <w:szCs w:val="17"/>
+                <w:vertAlign w:val="subscript"/>
+              </w:rPr>
+              <w:t>0</w:t>
+            </w:r>
+            <w:r>
+              <w:rPr>
+                <w:rFonts w:ascii="Times New Roman" w:hAnsi="Times New Roman" w:cs="Times New Roman"/>
+                <w:sz w:val="17"/>
+                <w:szCs w:val="17"/>
+              </w:rPr>
+              <w:t xml:space="preserve"> (5.6 GHz)</w:t>
             </w:r>
           </w:p>
         </w:tc>
@@ -4602,13 +4704,13 @@
                 <w:sz w:val="17"/>
                 <w:szCs w:val="17"/>
               </w:rPr>
-              <w:t>?</w:t>
+              <w:t>4.76–6.77 (meas.)</w:t>
             </w:r>
           </w:p>
         </w:tc>
         <w:tc>
           <w:tcPr>
-            <w:tcW w:type="dxa" w:w="2232"/>
+            <w:tcW w:type="dxa" w:w="2016"/>
             <w:vAlign w:val="center"/>
           </w:tcPr>
           <w:p>
@@ -4622,7 +4724,7 @@
                 <w:sz w:val="17"/>
                 <w:szCs w:val="17"/>
               </w:rPr>
-              <w:t>?; ?</w:t>
+              <w:t>Polarization-conversion metasurface; circular polarization and gain</w:t>
             </w:r>
           </w:p>
         </w:tc>
@@ -4642,13 +4744,13 @@
                 <w:sz w:val="17"/>
                 <w:szCs w:val="17"/>
               </w:rPr>
-              <w:t>?</w:t>
+              <w:t>&gt; 19.85 (strip)</w:t>
             </w:r>
           </w:p>
         </w:tc>
         <w:tc>
           <w:tcPr>
-            <w:tcW w:type="dxa" w:w="864"/>
+            <w:tcW w:type="dxa" w:w="1080"/>
             <w:vAlign w:val="center"/>
           </w:tcPr>
           <w:p>
@@ -4662,7 +4764,7 @@
                 <w:sz w:val="17"/>
                 <w:szCs w:val="17"/>
               </w:rPr>
-              <w:t>?</w:t>
+              <w:t>&lt; 0.007</w:t>
             </w:r>
           </w:p>
         </w:tc>
@@ -4682,7 +4784,7 @@
                 <w:sz w:val="17"/>
                 <w:szCs w:val="17"/>
               </w:rPr>
-              <w:t>?</w:t>
+              <w:t>7.95 dBic</w:t>
             </w:r>
           </w:p>
         </w:tc>
@@ -4700,10 +4802,85 @@
       <w:r>
         <w:rPr>
           <w:rFonts w:ascii="Times New Roman" w:hAnsi="Times New Roman" w:cs="Times New Roman"/>
-          <w:sz w:val="24"/>
-          <w:szCs w:val="24"/>
-        </w:rPr>
-        <w:t>[Research gap: to be completed from the full texts.]</w:t>
+          <w:b/>
+          <w:sz w:val="24"/>
+          <w:szCs w:val="24"/>
+        </w:rPr>
+        <w:t>Reflector distance.</w:t>
+      </w:r>
+      <w:r>
+        <w:rPr>
+          <w:rFonts w:ascii="Times New Roman" w:hAnsi="Times New Roman" w:cs="Times New Roman"/>
+          <w:sz w:val="24"/>
+          <w:szCs w:val="24"/>
+        </w:rPr>
+        <w:t xml:space="preserve"> The single-antenna reflectors reviewed sit 9 mm [15], 10 mm (total profile) [14] and 20 mm [16] behind the antenna, about 0.07–0.21 of a wavelength at the lowest operating frequency. The ground-backed AMC of [17] sits closer across a small air gap, but its band (3.5–6.5 GHz) is far narrower than UWB. Phase I places the metasurface only 3.9 mm (0.04λ at 3.1 GHz) behind an antenna that covers 2.16–15.73 GHz: a lower profile, but a harder in-phase condition and stronger near-field loading.</w:t>
+      </w:r>
+    </w:p>
+    <w:p>
+      <w:pPr>
+        <w:jc w:val="both"/>
+      </w:pPr>
+      <w:r>
+        <w:rPr>
+          <w:rFonts w:ascii="Times New Roman" w:hAnsi="Times New Roman" w:cs="Times New Roman"/>
+          <w:b/>
+          <w:sz w:val="24"/>
+          <w:szCs w:val="24"/>
+        </w:rPr>
+        <w:t>Cell type.</w:t>
+      </w:r>
+      <w:r>
+        <w:rPr>
+          <w:rFonts w:ascii="Times New Roman" w:hAnsi="Times New Roman" w:cs="Times New Roman"/>
+          <w:sz w:val="24"/>
+          <w:szCs w:val="24"/>
+        </w:rPr>
+        <w:t xml:space="preserve"> Only [13] uses split-ring cells behind a UWB monopole, varying the split angle across the array to widen the in-phase band; the others use ring, loop and patch FSS or AMC cells [14]–[17]. A split-ring metasurface also appears in the MIMO design of [20], but over 3.1–7.7 GHz. A single-SRR metasurface behind a CPW-fed antenna covering the whole UWB band is not reported in the papers reviewed.</w:t>
+      </w:r>
+    </w:p>
+    <w:p>
+      <w:pPr>
+        <w:jc w:val="both"/>
+      </w:pPr>
+      <w:r>
+        <w:rPr>
+          <w:rFonts w:ascii="Times New Roman" w:hAnsi="Times New Roman" w:cs="Times New Roman"/>
+          <w:b/>
+          <w:sz w:val="24"/>
+          <w:szCs w:val="24"/>
+        </w:rPr>
+        <w:t>Baselines and reporting.</w:t>
+      </w:r>
+      <w:r>
+        <w:rPr>
+          <w:rFonts w:ascii="Times New Roman" w:hAnsi="Times New Roman" w:cs="Times New Roman"/>
+          <w:sz w:val="24"/>
+          <w:szCs w:val="24"/>
+        </w:rPr>
+        <w:t xml:space="preserve"> Neither of the two papers read in full compares its reflector with a plain metal plate at the same gap, and gain is usually quoted as a single peak value, often without saying whether it is realized gain. This project compares the antenna alone, a metal plate and the SRR metasurface at the same 3.9 mm gap, reports gain across the band and states which gain is shown.</w:t>
+      </w:r>
+    </w:p>
+    <w:p>
+      <w:pPr>
+        <w:jc w:val="both"/>
+      </w:pPr>
+      <w:r>
+        <w:rPr>
+          <w:rFonts w:ascii="Times New Roman" w:hAnsi="Times New Roman" w:cs="Times New Roman"/>
+          <w:b/>
+          <w:sz w:val="24"/>
+          <w:szCs w:val="24"/>
+        </w:rPr>
+        <w:t>MIMO.</w:t>
+      </w:r>
+      <w:r>
+        <w:rPr>
+          <w:rFonts w:ascii="Times New Roman" w:hAnsi="Times New Roman" w:cs="Times New Roman"/>
+          <w:sz w:val="24"/>
+          <w:szCs w:val="24"/>
+        </w:rPr>
+        <w:t xml:space="preserve"> The MIMO papers use metasurfaces for gain [19], [20], for decoupling together with other structures [18], [21] and for polarization conversion [22], but all in bands far narrower than UWB (3.3–3.87, 3.1–7.7, 5.0–6.6, 4.76–6.77 and 23.5–29.4 GHz). A UWB MIMO antenna with an SRR metasurface reflector is the open target of Phase II.</w:t>
       </w:r>
     </w:p>
     <w:p>
@@ -11226,7 +11403,7 @@
         </w:rPr>
         <w:t>[13]</w:t>
         <w:tab/>
-        <w:t xml:space="preserve">Sen, Banerjee, Kumar, and Das, “An ultra-wideband monopole antenna with a gain enhanced performance using a novel split-ring meta-surface reflector,” </w:t>
+        <w:t xml:space="preserve">G. Sen, A. Banerjee, M. Kumar, and S. Das, “An ultra-wideband monopole antenna with a gain enhanced performance using a novel split-ring meta-surface reflector,” </w:t>
       </w:r>
       <w:r>
         <w:rPr>
@@ -11243,7 +11420,7 @@
           <w:sz w:val="24"/>
           <w:szCs w:val="24"/>
         </w:rPr>
-        <w:t>, vol. 59, pp. 1296–1300, 2017, doi: 10.1002/mop.30527.</w:t>
+        <w:t>, vol. 59, no. 6, pp. 1296–1300, 2017, doi: 10.1002/mop.30527.</w:t>
       </w:r>
     </w:p>
     <w:p>
@@ -11263,7 +11440,7 @@
         </w:rPr>
         <w:t>[14]</w:t>
         <w:tab/>
-        <w:t xml:space="preserve">M. AboEl-Hassan, A. E. Farahat, and K. F. A. Hussein, “Gain enhancement wideband CPW antenna based on artificial magnetic conductor,” </w:t>
+        <w:t xml:space="preserve">A. J. A. Al-Gburi, I. B. M. Ibrahim, Z. Zakaria, B. H. Ahmad, N. A. B. Shairi, and M. Y. Zeain, “High gain of UWB planar antenna utilising FSS reflector for UWB applications,” </w:t>
       </w:r>
       <w:r>
         <w:rPr>
@@ -11272,15 +11449,15 @@
           <w:sz w:val="24"/>
           <w:szCs w:val="24"/>
         </w:rPr>
-        <w:t>Sci. Rep.</w:t>
-      </w:r>
-      <w:r>
-        <w:rPr>
-          <w:rFonts w:ascii="Times New Roman" w:hAnsi="Times New Roman" w:cs="Times New Roman"/>
-          <w:sz w:val="24"/>
-          <w:szCs w:val="24"/>
-        </w:rPr>
-        <w:t>, 2025, doi: 10.1038/s41598-025-89622-9.</w:t>
+        <w:t>Comput. Mater. Contin.</w:t>
+      </w:r>
+      <w:r>
+        <w:rPr>
+          <w:rFonts w:ascii="Times New Roman" w:hAnsi="Times New Roman" w:cs="Times New Roman"/>
+          <w:sz w:val="24"/>
+          <w:szCs w:val="24"/>
+        </w:rPr>
+        <w:t>, vol. 70, no. 1, pp. 1425–1436, 2022, doi: 10.32604/cmc.2022.019741.</w:t>
       </w:r>
     </w:p>
     <w:p>
@@ -11300,7 +11477,7 @@
         </w:rPr>
         <w:t>[15]</w:t>
         <w:tab/>
-        <w:t xml:space="preserve">M. Hussain </w:t>
+        <w:t xml:space="preserve">M. Hussain, M. A. Sufian, M. S. Alzaidi, S. I. Naqvi, N. Hussain, D. H. Elkamchouchi, M. F. A. Sree, and S. Y. A. Fatah, “Bandwidth and gain enhancement of a CPW antenna using frequency selective surface for UWB applications,” </w:t>
       </w:r>
       <w:r>
         <w:rPr>
@@ -11309,23 +11486,6 @@
           <w:sz w:val="24"/>
           <w:szCs w:val="24"/>
         </w:rPr>
-        <w:t>et al.</w:t>
-      </w:r>
-      <w:r>
-        <w:rPr>
-          <w:rFonts w:ascii="Times New Roman" w:hAnsi="Times New Roman" w:cs="Times New Roman"/>
-          <w:sz w:val="24"/>
-          <w:szCs w:val="24"/>
-        </w:rPr>
-        <w:t xml:space="preserve">, “Bandwidth and gain enhancement of a CPW antenna using frequency selective surface for UWB applications,” </w:t>
-      </w:r>
-      <w:r>
-        <w:rPr>
-          <w:rFonts w:ascii="Times New Roman" w:hAnsi="Times New Roman" w:cs="Times New Roman"/>
-          <w:i/>
-          <w:sz w:val="24"/>
-          <w:szCs w:val="24"/>
-        </w:rPr>
         <w:t>Micromachines</w:t>
       </w:r>
       <w:r>
@@ -11334,7 +11494,7 @@
           <w:sz w:val="24"/>
           <w:szCs w:val="24"/>
         </w:rPr>
-        <w:t>, vol. 14, no. 3, Art. no. 591, 2023, doi: 10.3390/mi14030591.</w:t>
+        <w:t>, vol. 14, no. 3, Art. no. 591, Feb. 2023, doi: 10.3390/mi14030591.</w:t>
       </w:r>
     </w:p>
     <w:p>
@@ -11354,7 +11514,7 @@
         </w:rPr>
         <w:t>[16]</w:t>
         <w:tab/>
-        <w:t xml:space="preserve">A. J. A. Al-Gburi, I. Ibrahim, Z. Zakaria, B. H. Ahmad, N. A. Shairi, and M. Y. Zeain, “High gain of UWB planar antenna utilising FSS reflector for UWB applications,” </w:t>
+        <w:t xml:space="preserve">B. Hammache, I. Messaoudene, M. Belazzoug, S. Titouni, A. Messai, and T. A. Denidni, “Gain enhancement of compact CPW-fed ultra-wideband antenna using an FSS reflector,” </w:t>
       </w:r>
       <w:r>
         <w:rPr>
@@ -11363,15 +11523,15 @@
           <w:sz w:val="24"/>
           <w:szCs w:val="24"/>
         </w:rPr>
-        <w:t>Comput. Mater. Contin.</w:t>
-      </w:r>
-      <w:r>
-        <w:rPr>
-          <w:rFonts w:ascii="Times New Roman" w:hAnsi="Times New Roman" w:cs="Times New Roman"/>
-          <w:sz w:val="24"/>
-          <w:szCs w:val="24"/>
-        </w:rPr>
-        <w:t>, vol. 70, no. 1, pp. 1425–1436, 2022.</w:t>
+        <w:t>Microw. Opt. Technol. Lett.</w:t>
+      </w:r>
+      <w:r>
+        <w:rPr>
+          <w:rFonts w:ascii="Times New Roman" w:hAnsi="Times New Roman" w:cs="Times New Roman"/>
+          <w:sz w:val="24"/>
+          <w:szCs w:val="24"/>
+        </w:rPr>
+        <w:t>, vol. 66, no. 10, Art. no. e34344, 2024, doi: 10.1002/mop.34344.</w:t>
       </w:r>
     </w:p>
     <w:p>
@@ -11391,7 +11551,7 @@
         </w:rPr>
         <w:t>[17]</w:t>
         <w:tab/>
-        <w:t xml:space="preserve">Hammache </w:t>
+        <w:t xml:space="preserve">M. AboEl-Hassan, A. E. Farahat, and K. F. A. Hussein, “Gain enhancement wideband CPW antenna based on artificial magnetic conductor,” </w:t>
       </w:r>
       <w:r>
         <w:rPr>
@@ -11400,32 +11560,15 @@
           <w:sz w:val="24"/>
           <w:szCs w:val="24"/>
         </w:rPr>
-        <w:t>et al.</w:t>
-      </w:r>
-      <w:r>
-        <w:rPr>
-          <w:rFonts w:ascii="Times New Roman" w:hAnsi="Times New Roman" w:cs="Times New Roman"/>
-          <w:sz w:val="24"/>
-          <w:szCs w:val="24"/>
-        </w:rPr>
-        <w:t xml:space="preserve">, “Gain enhancement of compact CPW-fed ultra-wideband antenna using an FSS reflector,” </w:t>
-      </w:r>
-      <w:r>
-        <w:rPr>
-          <w:rFonts w:ascii="Times New Roman" w:hAnsi="Times New Roman" w:cs="Times New Roman"/>
-          <w:i/>
-          <w:sz w:val="24"/>
-          <w:szCs w:val="24"/>
-        </w:rPr>
-        <w:t>Microw. Opt. Technol. Lett.</w:t>
-      </w:r>
-      <w:r>
-        <w:rPr>
-          <w:rFonts w:ascii="Times New Roman" w:hAnsi="Times New Roman" w:cs="Times New Roman"/>
-          <w:sz w:val="24"/>
-          <w:szCs w:val="24"/>
-        </w:rPr>
-        <w:t>, 2024, doi: 10.1002/mop.34344.</w:t>
+        <w:t>Sci. Rep.</w:t>
+      </w:r>
+      <w:r>
+        <w:rPr>
+          <w:rFonts w:ascii="Times New Roman" w:hAnsi="Times New Roman" w:cs="Times New Roman"/>
+          <w:sz w:val="24"/>
+          <w:szCs w:val="24"/>
+        </w:rPr>
+        <w:t>, vol. 15, Art. no. 7108, 2025, doi: 10.1038/s41598-025-89622-9.</w:t>
       </w:r>
     </w:p>
     <w:p>
@@ -11462,7 +11605,7 @@
           <w:sz w:val="24"/>
           <w:szCs w:val="24"/>
         </w:rPr>
-        <w:t>, vol. 9, pp. 73533–73543, 2021.</w:t>
+        <w:t>, vol. 9, pp. 73533–73543, 2021, doi: 10.1109/ACCESS.2021.3079965.</w:t>
       </w:r>
     </w:p>
     <w:p>
@@ -11482,7 +11625,7 @@
         </w:rPr>
         <w:t>[19]</w:t>
         <w:tab/>
-        <w:t xml:space="preserve">M. M. Hasan, M. T. Islam, M. Samsuzzaman, M. H. Baharuddin, M. S. Soliman, A. Alzamil, I. I. M. Abu Sulayman, and M. S. Islam, “Gain and isolation enhancement of a wideband MIMO antenna using metasurface for 5G sub-6 GHz communication systems,” </w:t>
+        <w:t xml:space="preserve">D. A. Sehrai, M. Asif, W. A. Shah, J. Khan, I. Ullah, M. Ibrar, S. Jan, M. Alibakhshikenari, F. Falcone, and E. Limiti, “Metasurface-based wideband MIMO antenna for 5G millimeter-wave systems,” </w:t>
       </w:r>
       <w:r>
         <w:rPr>
@@ -11491,15 +11634,15 @@
           <w:sz w:val="24"/>
           <w:szCs w:val="24"/>
         </w:rPr>
-        <w:t>Sci. Rep.</w:t>
-      </w:r>
-      <w:r>
-        <w:rPr>
-          <w:rFonts w:ascii="Times New Roman" w:hAnsi="Times New Roman" w:cs="Times New Roman"/>
-          <w:sz w:val="24"/>
-          <w:szCs w:val="24"/>
-        </w:rPr>
-        <w:t>, vol. 12, 2022, doi: 10.1038/s41598-022-13522-5.</w:t>
+        <w:t>IEEE Access</w:t>
+      </w:r>
+      <w:r>
+        <w:rPr>
+          <w:rFonts w:ascii="Times New Roman" w:hAnsi="Times New Roman" w:cs="Times New Roman"/>
+          <w:sz w:val="24"/>
+          <w:szCs w:val="24"/>
+        </w:rPr>
+        <w:t>, vol. 9, pp. 125348–125357, 2021, doi: 10.1109/ACCESS.2021.3110905.</w:t>
       </w:r>
     </w:p>
     <w:p>
@@ -11519,7 +11662,7 @@
         </w:rPr>
         <w:t>[20]</w:t>
         <w:tab/>
-        <w:t xml:space="preserve">A. A. Althuwayb </w:t>
+        <w:t xml:space="preserve">M. M. Hasan, M. T. Islam, M. Samsuzzaman, M. H. Baharuddin, M. S. Soliman, A. Alzamil, I. I. M. Abu Sulayman, and M. S. Islam, “Gain and isolation enhancement of a wideband MIMO antenna using metasurface for 5G sub-6 GHz communication systems,” </w:t>
       </w:r>
       <w:r>
         <w:rPr>
@@ -11528,32 +11671,15 @@
           <w:sz w:val="24"/>
           <w:szCs w:val="24"/>
         </w:rPr>
-        <w:t>et al.</w:t>
-      </w:r>
-      <w:r>
-        <w:rPr>
-          <w:rFonts w:ascii="Times New Roman" w:hAnsi="Times New Roman" w:cs="Times New Roman"/>
-          <w:sz w:val="24"/>
-          <w:szCs w:val="24"/>
-        </w:rPr>
-        <w:t xml:space="preserve">, “Metasurface-inspired flexible wearable MIMO antenna array for wireless body area network applications and biomedical telemetry devices,” </w:t>
-      </w:r>
-      <w:r>
-        <w:rPr>
-          <w:rFonts w:ascii="Times New Roman" w:hAnsi="Times New Roman" w:cs="Times New Roman"/>
-          <w:i/>
-          <w:sz w:val="24"/>
-          <w:szCs w:val="24"/>
-        </w:rPr>
-        <w:t>IEEE Access</w:t>
-      </w:r>
-      <w:r>
-        <w:rPr>
-          <w:rFonts w:ascii="Times New Roman" w:hAnsi="Times New Roman" w:cs="Times New Roman"/>
-          <w:sz w:val="24"/>
-          <w:szCs w:val="24"/>
-        </w:rPr>
-        <w:t>, 2023.</w:t>
+        <w:t>Sci. Rep.</w:t>
+      </w:r>
+      <w:r>
+        <w:rPr>
+          <w:rFonts w:ascii="Times New Roman" w:hAnsi="Times New Roman" w:cs="Times New Roman"/>
+          <w:sz w:val="24"/>
+          <w:szCs w:val="24"/>
+        </w:rPr>
+        <w:t>, vol. 12, Art. no. 9433, 2022, doi: 10.1038/s41598-022-13522-5.</w:t>
       </w:r>
     </w:p>
     <w:p>
@@ -11573,7 +11699,7 @@
         </w:rPr>
         <w:t>[21]</w:t>
         <w:tab/>
-        <w:t xml:space="preserve">R. Wu, J. Dong, and M. Wang, “Wearable polarization conversion metasurface MIMO antenna for biomedical applications in 5 GHz WBAN,” </w:t>
+        <w:t xml:space="preserve">A. A. Althuwayb, M. Alibakhshikenari, B. S. Virdee, N. Rashid, K. Kaaniche, A. Ben Atitallah, A. Armghan, O. I. Elhamrawy, C. H. See, and F. Falcone, “Metasurface-inspired flexible wearable MIMO antenna array for wireless body area network applications and biomedical telemetry devices,” </w:t>
       </w:r>
       <w:r>
         <w:rPr>
@@ -11582,15 +11708,15 @@
           <w:sz w:val="24"/>
           <w:szCs w:val="24"/>
         </w:rPr>
-        <w:t>Biosensors</w:t>
-      </w:r>
-      <w:r>
-        <w:rPr>
-          <w:rFonts w:ascii="Times New Roman" w:hAnsi="Times New Roman" w:cs="Times New Roman"/>
-          <w:sz w:val="24"/>
-          <w:szCs w:val="24"/>
-        </w:rPr>
-        <w:t>, vol. 13, no. 1, Art. no. 73, 2023, doi: 10.3390/bios13010073.</w:t>
+        <w:t>IEEE Access</w:t>
+      </w:r>
+      <w:r>
+        <w:rPr>
+          <w:rFonts w:ascii="Times New Roman" w:hAnsi="Times New Roman" w:cs="Times New Roman"/>
+          <w:sz w:val="24"/>
+          <w:szCs w:val="24"/>
+        </w:rPr>
+        <w:t>, vol. 11, pp. 1039–1056, 2023, doi: 10.1109/ACCESS.2022.3233388.</w:t>
       </w:r>
     </w:p>
     <w:p>
@@ -11610,7 +11736,7 @@
         </w:rPr>
         <w:t>[22]</w:t>
         <w:tab/>
-        <w:t xml:space="preserve">“Metasurface-based wideband MIMO antenna for 5G millimeter-wave systems,” </w:t>
+        <w:t xml:space="preserve">R. Wu, J. Dong, and M. Wang, “Wearable polarization conversion metasurface MIMO antenna for biomedical applications in 5 GHz WBAN,” </w:t>
       </w:r>
       <w:r>
         <w:rPr>
@@ -11619,15 +11745,15 @@
           <w:sz w:val="24"/>
           <w:szCs w:val="24"/>
         </w:rPr>
-        <w:t>IEEE Access</w:t>
-      </w:r>
-      <w:r>
-        <w:rPr>
-          <w:rFonts w:ascii="Times New Roman" w:hAnsi="Times New Roman" w:cs="Times New Roman"/>
-          <w:sz w:val="24"/>
-          <w:szCs w:val="24"/>
-        </w:rPr>
-        <w:t>, 2021.</w:t>
+        <w:t>Biosensors</w:t>
+      </w:r>
+      <w:r>
+        <w:rPr>
+          <w:rFonts w:ascii="Times New Roman" w:hAnsi="Times New Roman" w:cs="Times New Roman"/>
+          <w:sz w:val="24"/>
+          <w:szCs w:val="24"/>
+        </w:rPr>
+        <w:t>, vol. 13, no. 1, Art. no. 73, 2023, doi: 10.3390/bios13010073.</w:t>
       </w:r>
     </w:p>
     <w:sectPr>

</xml_diff>